<commit_message>
docs: add public repository link to application materials
</commit_message>
<xml_diff>
--- a/email/resume-1page.docx
+++ b/email/resume-1page.docx
@@ -26,7 +26,7 @@
           <w:sz w:val="16"/>
           <w:color w:val="444444"/>
         </w:rPr>
-        <w:t xml:space="preserve">山东大学人工智能学院 · 2026 级本科生 ｜ 手机：[手机号] ｜ 邮箱：[邮箱] ｜ GitHub：[GitHub 账号] ｜ 学号：[学号]</w:t>
+        <w:t xml:space="preserve">山东大学人工智能学院 · 2026 级本科生 ｜ 手机：[手机号] ｜ 邮箱：[邮箱] ｜ GitHub：wznrenyilizhixin-sudo ｜ 学号：[学号]</w:t>
       </w:r>
     </w:p>
     <w:p>
@@ -426,7 +426,7 @@
           <w:sz w:val="18"/>
           <w:color w:val="111111"/>
         </w:rPr>
-        <w:t xml:space="preserve">• 公开仓库：[GitHub 仓库链接]</w:t>
+        <w:t xml:space="preserve">• 公开仓库：https://github.com/wznrenyilizhixin-sudo/ifmif-dones-domain-qa</w:t>
       </w:r>
     </w:p>
     <w:p>

</xml_diff>